<commit_message>
docs: clean and standard typography Word document for POC discussion
</commit_message>
<xml_diff>
--- a/RankUno_POC_Discussion_Document.docx
+++ b/RankUno_POC_Discussion_Document.docx
@@ -4,7 +4,7 @@
   <w:body>
     <w:p>
       <w:pPr>
-        <w:spacing w:before="0" w:after="20"/>
+        <w:spacing w:before="0" w:after="40"/>
       </w:pPr>
       <w:r>
         <w:rPr>
@@ -12,686 +12,676 @@
           <w:color w:val="0F172A"/>
           <w:sz w:val="36"/>
         </w:rPr>
-        <w:t>PromptPulse: GEO &amp; AI Brand Visibility Tracker</w:t>
+        <w:t>PromptPulse: Technical Approach, Architecture &amp; Learning Review</w:t>
       </w:r>
     </w:p>
     <w:p>
       <w:pPr>
-        <w:spacing w:before="0" w:after="240"/>
+        <w:spacing w:before="0" w:after="280"/>
       </w:pPr>
       <w:r>
         <w:rPr>
-          <w:color w:val="475569"/>
-          <w:sz w:val="22"/>
+          <w:color w:val="64748B"/>
+          <w:sz w:val="23"/>
         </w:rPr>
-        <w:t>POC Approach, Architecture, Breaking Points, Bottlenecks &amp; SEO/GEO Learnings</w:t>
+        <w:t>POC Discussion Document — Engineering Bottlenecks, SEO/GEO Insights &amp; Implementation Plan</w:t>
       </w:r>
     </w:p>
     <w:p>
       <w:pPr>
-        <w:pStyle w:val="Heading1"/>
+        <w:spacing w:before="280" w:after="80"/>
       </w:pPr>
       <w:r>
+        <w:rPr>
+          <w:b/>
+          <w:color w:val="0F172A"/>
+          <w:sz w:val="30"/>
+        </w:rPr>
         <w:t>1. How We Approached the Problem</w:t>
       </w:r>
     </w:p>
     <w:p>
       <w:pPr>
-        <w:spacing w:after="80"/>
+        <w:spacing w:line="276" w:lineRule="auto" w:after="80"/>
       </w:pPr>
       <w:r>
-        <w:t>Search behavior is fundamentally shifting from traditional search engines (ten blue links) to generative answer engines (ChatGPT Search, Perplexity, Google AI Overviews, Gemini). Traditional SEO tools measure keyword ranks and backlink counts, leaving digital marketers blind to whether an AI actually recommends, critiques, or cites their brand.</w:t>
+        <w:rPr>
+          <w:color w:val="334155"/>
+        </w:rPr>
+        <w:t>Search behavior is fundamentally shifting from traditional search engines (ten blue links) to generative AI answer engines like ChatGPT Search, Perplexity, Google AI Overviews, and Gemini. Traditional SEO tools measure keyword rankings (#1 to #10) and backlink volume, which provides zero visibility into whether an AI model mentions, recommends, compares, or cites a brand.</w:t>
       </w:r>
     </w:p>
     <w:p>
       <w:pPr>
-        <w:spacing w:after="120"/>
+        <w:spacing w:line="276" w:lineRule="auto" w:after="80"/>
       </w:pPr>
       <w:r>
-        <w:t>We selected Problem Statement A (GEO Prompt &amp; Brand Visibility Tracker) and approached it through an end-to-end 4-step workflow:</w:t>
-        <w:br/>
-        <w:t>1. Brand-Agnostic Prompt Suites: Designed prompts that reflect natural, non-branded consumer queries (e.g., 'best free online graphic design tools').</w:t>
-        <w:br/>
-        <w:t>2. Grounded Multi-Step AI Agent: Implemented an autonomous ReAct loop where the LLM queries Tavily Web Search, reviews live results, and writes synthesized answers with inline bracket citations [X].</w:t>
-        <w:br/>
-        <w:t>3. Hybrid Verification Engine: Combined deterministic regex with Levenshtein fuzzy matching (&gt;= 0.82) to eliminate hallucinated brand mentions, followed by structured Pydantic LLM extraction for competitor discovery and sentiment.</w:t>
-        <w:br/>
-        <w:t>4. Versioned Batch Tracking: Implemented chronological batch execution and relational persistence to observe visibility changes over time.</w:t>
+        <w:rPr>
+          <w:color w:val="334155"/>
+        </w:rPr>
+        <w:t>We built PromptPulse (addressing Problem Statement A: GEO Prompt &amp; Brand Visibility Tracker) to track brand presence inside AI-generated answers through an end-to-end workflow:</w:t>
       </w:r>
     </w:p>
     <w:p>
       <w:pPr>
-        <w:pStyle w:val="Heading1"/>
-      </w:pPr>
-      <w:r>
-        <w:t>2. System Architecture</w:t>
-      </w:r>
-    </w:p>
-    <w:tbl>
-      <w:tblPr>
-        <w:tblW w:type="auto" w:w="0"/>
-        <w:jc w:val="center"/>
-        <w:tblLook w:firstColumn="1" w:firstRow="1" w:lastColumn="0" w:lastRow="0" w:noHBand="0" w:noVBand="1" w:val="04A0"/>
-      </w:tblPr>
-      <w:tblGrid>
-        <w:gridCol w:w="9936"/>
-      </w:tblGrid>
-      <w:tr>
-        <w:tc>
-          <w:tcPr>
-            <w:tcW w:type="dxa" w:w="9936"/>
-            <w:shd w:fill="F8FAFC"/>
-            <w:tcMar>
-              <w:top w:w="100" w:type="dxa"/>
-              <w:bottom w:w="100" w:type="dxa"/>
-              <w:left w:w="160" w:type="dxa"/>
-              <w:right w:w="160" w:type="dxa"/>
-            </w:tcMar>
-            <w:tcBorders>
-              <w:left w:val="single" w:sz="18" w:space="0" w:color="2563EB"/>
-              <w:top w:val="single" w:sz="6" w:space="0" w:color="CBD5E1"/>
-              <w:right w:val="single" w:sz="6" w:space="0" w:color="CBD5E1"/>
-              <w:bottom w:val="single" w:sz="6" w:space="0" w:color="CBD5E1"/>
-            </w:tcBorders>
-          </w:tcPr>
-          <w:p>
-            <w:pPr>
-              <w:spacing w:before="0" w:after="40"/>
-            </w:pPr>
-            <w:r>
-              <w:rPr>
-                <w:b/>
-                <w:color w:val="0F172A"/>
-                <w:sz w:val="21"/>
-              </w:rPr>
-              <w:t>Frontend Layer (React 19 + Vite + Tailwind CSS)</w:t>
-            </w:r>
-          </w:p>
-          <w:p>
-            <w:pPr>
-              <w:spacing w:before="20" w:after="20"/>
-            </w:pPr>
-            <w:r>
-              <w:rPr>
-                <w:b/>
-                <w:color w:val="2563EB"/>
-              </w:rPr>
-              <w:t xml:space="preserve">▸ </w:t>
-            </w:r>
-            <w:r>
-              <w:rPr>
-                <w:color w:val="334155"/>
-                <w:sz w:val="19"/>
-              </w:rPr>
-              <w:t>Prompt suite creation, project switcher, and dynamic model selector (Groq / OpenRouter)</w:t>
-            </w:r>
-          </w:p>
-          <w:p>
-            <w:pPr>
-              <w:spacing w:before="20" w:after="20"/>
-            </w:pPr>
-            <w:r>
-              <w:rPr>
-                <w:b/>
-                <w:color w:val="2563EB"/>
-              </w:rPr>
-              <w:t xml:space="preserve">▸ </w:t>
-            </w:r>
-            <w:r>
-              <w:rPr>
-                <w:color w:val="334155"/>
-                <w:sz w:val="19"/>
-              </w:rPr>
-              <w:t>Batch-first view with rectangular badge identifiers and fixed-width tables (zero scrollbars)</w:t>
-            </w:r>
-          </w:p>
-          <w:p>
-            <w:pPr>
-              <w:spacing w:before="20" w:after="20"/>
-            </w:pPr>
-            <w:r>
-              <w:rPr>
-                <w:b/>
-                <w:color w:val="2563EB"/>
-              </w:rPr>
-              <w:t xml:space="preserve">▸ </w:t>
-            </w:r>
-            <w:r>
-              <w:rPr>
-                <w:color w:val="334155"/>
-                <w:sz w:val="19"/>
-              </w:rPr>
-              <w:t>Optimistic state updates: instant 0ms UI deletion with background API synchronization</w:t>
-            </w:r>
-          </w:p>
-        </w:tc>
-      </w:tr>
-    </w:tbl>
-    <w:p>
-      <w:pPr>
-        <w:spacing w:before="40" w:after="40"/>
-        <w:jc w:val="center"/>
+        <w:pStyle w:val="ListBullet"/>
+        <w:spacing w:line="276" w:lineRule="auto" w:after="80"/>
       </w:pPr>
       <w:r>
         <w:rPr>
-          <w:color w:val="94A3B8"/>
-          <w:sz w:val="18"/>
+          <w:b/>
+          <w:color w:val="0F172A"/>
         </w:rPr>
-        <w:t>▼</w:t>
+        <w:t>Brand-Agnostic Prompt Suites:</w:t>
       </w:r>
-    </w:p>
-    <w:tbl>
-      <w:tblPr>
-        <w:tblW w:type="auto" w:w="0"/>
-        <w:jc w:val="center"/>
-        <w:tblLook w:firstColumn="1" w:firstRow="1" w:lastColumn="0" w:lastRow="0" w:noHBand="0" w:noVBand="1" w:val="04A0"/>
-      </w:tblPr>
-      <w:tblGrid>
-        <w:gridCol w:w="9936"/>
-      </w:tblGrid>
-      <w:tr>
-        <w:tc>
-          <w:tcPr>
-            <w:tcW w:type="dxa" w:w="9936"/>
-            <w:shd w:fill="F8FAFC"/>
-            <w:tcMar>
-              <w:top w:w="100" w:type="dxa"/>
-              <w:bottom w:w="100" w:type="dxa"/>
-              <w:left w:w="160" w:type="dxa"/>
-              <w:right w:w="160" w:type="dxa"/>
-            </w:tcMar>
-            <w:tcBorders>
-              <w:left w:val="single" w:sz="18" w:space="0" w:color="2563EB"/>
-              <w:top w:val="single" w:sz="6" w:space="0" w:color="CBD5E1"/>
-              <w:right w:val="single" w:sz="6" w:space="0" w:color="CBD5E1"/>
-              <w:bottom w:val="single" w:sz="6" w:space="0" w:color="CBD5E1"/>
-            </w:tcBorders>
-          </w:tcPr>
-          <w:p>
-            <w:pPr>
-              <w:spacing w:before="0" w:after="40"/>
-            </w:pPr>
-            <w:r>
-              <w:rPr>
-                <w:b/>
-                <w:color w:val="0F172A"/>
-                <w:sz w:val="21"/>
-              </w:rPr>
-              <w:t>Application &amp; API Layer (FastAPI + Pydantic v2)</w:t>
-            </w:r>
-          </w:p>
-          <w:p>
-            <w:pPr>
-              <w:spacing w:before="20" w:after="20"/>
-            </w:pPr>
-            <w:r>
-              <w:rPr>
-                <w:b/>
-                <w:color w:val="2563EB"/>
-              </w:rPr>
-              <w:t xml:space="preserve">▸ </w:t>
-            </w:r>
-            <w:r>
-              <w:rPr>
-                <w:color w:val="334155"/>
-                <w:sz w:val="19"/>
-              </w:rPr>
-              <w:t>REST endpoints (/projects, /prompts, /runs, /results) enforcing strict data contracts</w:t>
-            </w:r>
-          </w:p>
-          <w:p>
-            <w:pPr>
-              <w:spacing w:before="20" w:after="20"/>
-            </w:pPr>
-            <w:r>
-              <w:rPr>
-                <w:b/>
-                <w:color w:val="2563EB"/>
-              </w:rPr>
-              <w:t xml:space="preserve">▸ </w:t>
-            </w:r>
-            <w:r>
-              <w:rPr>
-                <w:color w:val="334155"/>
-                <w:sz w:val="19"/>
-              </w:rPr>
-              <w:t>Orchestration service coordinating prompt runs and batch executions</w:t>
-            </w:r>
-          </w:p>
-        </w:tc>
-      </w:tr>
-    </w:tbl>
-    <w:p>
-      <w:pPr>
-        <w:spacing w:before="40" w:after="40"/>
-        <w:jc w:val="center"/>
-      </w:pPr>
       <w:r>
         <w:rPr>
-          <w:color w:val="94A3B8"/>
-          <w:sz w:val="18"/>
+          <w:color w:val="334155"/>
         </w:rPr>
-        <w:t>▼</w:t>
-      </w:r>
-    </w:p>
-    <w:tbl>
-      <w:tblPr>
-        <w:tblW w:type="auto" w:w="0"/>
-        <w:jc w:val="center"/>
-        <w:tblLook w:firstColumn="1" w:firstRow="1" w:lastColumn="0" w:lastRow="0" w:noHBand="0" w:noVBand="1" w:val="04A0"/>
-      </w:tblPr>
-      <w:tblGrid>
-        <w:gridCol w:w="9936"/>
-      </w:tblGrid>
-      <w:tr>
-        <w:tc>
-          <w:tcPr>
-            <w:tcW w:type="dxa" w:w="9936"/>
-            <w:shd w:fill="F8FAFC"/>
-            <w:tcMar>
-              <w:top w:w="100" w:type="dxa"/>
-              <w:bottom w:w="100" w:type="dxa"/>
-              <w:left w:w="160" w:type="dxa"/>
-              <w:right w:w="160" w:type="dxa"/>
-            </w:tcMar>
-            <w:tcBorders>
-              <w:left w:val="single" w:sz="18" w:space="0" w:color="2563EB"/>
-              <w:top w:val="single" w:sz="6" w:space="0" w:color="CBD5E1"/>
-              <w:right w:val="single" w:sz="6" w:space="0" w:color="CBD5E1"/>
-              <w:bottom w:val="single" w:sz="6" w:space="0" w:color="CBD5E1"/>
-            </w:tcBorders>
-          </w:tcPr>
-          <w:p>
-            <w:pPr>
-              <w:spacing w:before="0" w:after="40"/>
-            </w:pPr>
-            <w:r>
-              <w:rPr>
-                <w:b/>
-                <w:color w:val="0F172A"/>
-                <w:sz w:val="21"/>
-              </w:rPr>
-              <w:t>Execution &amp; Grounding Layer (Tavily Search + Multi-LLM)</w:t>
-            </w:r>
-          </w:p>
-          <w:p>
-            <w:pPr>
-              <w:spacing w:before="20" w:after="20"/>
-            </w:pPr>
-            <w:r>
-              <w:rPr>
-                <w:b/>
-                <w:color w:val="2563EB"/>
-              </w:rPr>
-              <w:t xml:space="preserve">▸ </w:t>
-            </w:r>
-            <w:r>
-              <w:rPr>
-                <w:color w:val="334155"/>
-                <w:sz w:val="19"/>
-              </w:rPr>
-              <w:t>ReAct agent loop triggering Tavily Web Search for real-time fact retrieval</w:t>
-            </w:r>
-          </w:p>
-          <w:p>
-            <w:pPr>
-              <w:spacing w:before="20" w:after="20"/>
-            </w:pPr>
-            <w:r>
-              <w:rPr>
-                <w:b/>
-                <w:color w:val="2563EB"/>
-              </w:rPr>
-              <w:t xml:space="preserve">▸ </w:t>
-            </w:r>
-            <w:r>
-              <w:rPr>
-                <w:color w:val="334155"/>
-                <w:sz w:val="19"/>
-              </w:rPr>
-              <w:t>Dual-provider LLM support: Groq (ultra-fast inference) and OpenRouter (frontier models)</w:t>
-            </w:r>
-          </w:p>
-          <w:p>
-            <w:pPr>
-              <w:spacing w:before="20" w:after="20"/>
-            </w:pPr>
-            <w:r>
-              <w:rPr>
-                <w:b/>
-                <w:color w:val="2563EB"/>
-              </w:rPr>
-              <w:t xml:space="preserve">▸ </w:t>
-            </w:r>
-            <w:r>
-              <w:rPr>
-                <w:color w:val="334155"/>
-                <w:sz w:val="19"/>
-              </w:rPr>
-              <w:t>Automated citation formatter enforcing inline [X] markers and closing 'CITED: 1, 2' manifests</w:t>
-            </w:r>
-          </w:p>
-        </w:tc>
-      </w:tr>
-    </w:tbl>
-    <w:p>
-      <w:pPr>
-        <w:spacing w:before="40" w:after="40"/>
-        <w:jc w:val="center"/>
-      </w:pPr>
-      <w:r>
-        <w:rPr>
-          <w:color w:val="94A3B8"/>
-          <w:sz w:val="18"/>
-        </w:rPr>
-        <w:t>▼</w:t>
-      </w:r>
-    </w:p>
-    <w:tbl>
-      <w:tblPr>
-        <w:tblW w:type="auto" w:w="0"/>
-        <w:jc w:val="center"/>
-        <w:tblLook w:firstColumn="1" w:firstRow="1" w:lastColumn="0" w:lastRow="0" w:noHBand="0" w:noVBand="1" w:val="04A0"/>
-      </w:tblPr>
-      <w:tblGrid>
-        <w:gridCol w:w="9936"/>
-      </w:tblGrid>
-      <w:tr>
-        <w:tc>
-          <w:tcPr>
-            <w:tcW w:type="dxa" w:w="9936"/>
-            <w:shd w:fill="F8FAFC"/>
-            <w:tcMar>
-              <w:top w:w="100" w:type="dxa"/>
-              <w:bottom w:w="100" w:type="dxa"/>
-              <w:left w:w="160" w:type="dxa"/>
-              <w:right w:w="160" w:type="dxa"/>
-            </w:tcMar>
-            <w:tcBorders>
-              <w:left w:val="single" w:sz="18" w:space="0" w:color="2563EB"/>
-              <w:top w:val="single" w:sz="6" w:space="0" w:color="CBD5E1"/>
-              <w:right w:val="single" w:sz="6" w:space="0" w:color="CBD5E1"/>
-              <w:bottom w:val="single" w:sz="6" w:space="0" w:color="CBD5E1"/>
-            </w:tcBorders>
-          </w:tcPr>
-          <w:p>
-            <w:pPr>
-              <w:spacing w:before="0" w:after="40"/>
-            </w:pPr>
-            <w:r>
-              <w:rPr>
-                <w:b/>
-                <w:color w:val="0F172A"/>
-                <w:sz w:val="21"/>
-              </w:rPr>
-              <w:t>Hybrid Extraction Layer (Deterministic + Structured LLM)</w:t>
-            </w:r>
-          </w:p>
-          <w:p>
-            <w:pPr>
-              <w:spacing w:before="20" w:after="20"/>
-            </w:pPr>
-            <w:r>
-              <w:rPr>
-                <w:b/>
-                <w:color w:val="2563EB"/>
-              </w:rPr>
-              <w:t xml:space="preserve">▸ </w:t>
-            </w:r>
-            <w:r>
-              <w:rPr>
-                <w:color w:val="334155"/>
-                <w:sz w:val="19"/>
-              </w:rPr>
-              <w:t>Deterministic matcher: Regex word boundaries (\bbrand\b) + typo distance ratio (0.82)</w:t>
-            </w:r>
-          </w:p>
-          <w:p>
-            <w:pPr>
-              <w:spacing w:before="20" w:after="20"/>
-            </w:pPr>
-            <w:r>
-              <w:rPr>
-                <w:b/>
-                <w:color w:val="2563EB"/>
-              </w:rPr>
-              <w:t xml:space="preserve">▸ </w:t>
-            </w:r>
-            <w:r>
-              <w:rPr>
-                <w:color w:val="334155"/>
-                <w:sz w:val="19"/>
-              </w:rPr>
-              <w:t>Structured extractor: Pydantic schemas parsing competitor lists, sentiment, and remarks</w:t>
-            </w:r>
-          </w:p>
-        </w:tc>
-      </w:tr>
-    </w:tbl>
-    <w:p>
-      <w:pPr>
-        <w:spacing w:before="40" w:after="40"/>
-        <w:jc w:val="center"/>
-      </w:pPr>
-      <w:r>
-        <w:rPr>
-          <w:color w:val="94A3B8"/>
-          <w:sz w:val="18"/>
-        </w:rPr>
-        <w:t>▼</w:t>
-      </w:r>
-    </w:p>
-    <w:tbl>
-      <w:tblPr>
-        <w:tblW w:type="auto" w:w="0"/>
-        <w:jc w:val="center"/>
-        <w:tblLook w:firstColumn="1" w:firstRow="1" w:lastColumn="0" w:lastRow="0" w:noHBand="0" w:noVBand="1" w:val="04A0"/>
-      </w:tblPr>
-      <w:tblGrid>
-        <w:gridCol w:w="9936"/>
-      </w:tblGrid>
-      <w:tr>
-        <w:tc>
-          <w:tcPr>
-            <w:tcW w:type="dxa" w:w="9936"/>
-            <w:shd w:fill="F8FAFC"/>
-            <w:tcMar>
-              <w:top w:w="100" w:type="dxa"/>
-              <w:bottom w:w="100" w:type="dxa"/>
-              <w:left w:w="160" w:type="dxa"/>
-              <w:right w:w="160" w:type="dxa"/>
-            </w:tcMar>
-            <w:tcBorders>
-              <w:left w:val="single" w:sz="18" w:space="0" w:color="2563EB"/>
-              <w:top w:val="single" w:sz="6" w:space="0" w:color="CBD5E1"/>
-              <w:right w:val="single" w:sz="6" w:space="0" w:color="CBD5E1"/>
-              <w:bottom w:val="single" w:sz="6" w:space="0" w:color="CBD5E1"/>
-            </w:tcBorders>
-          </w:tcPr>
-          <w:p>
-            <w:pPr>
-              <w:spacing w:before="0" w:after="40"/>
-            </w:pPr>
-            <w:r>
-              <w:rPr>
-                <w:b/>
-                <w:color w:val="0F172A"/>
-                <w:sz w:val="21"/>
-              </w:rPr>
-              <w:t>Persistence Layer (Neon Serverless PostgreSQL)</w:t>
-            </w:r>
-          </w:p>
-          <w:p>
-            <w:pPr>
-              <w:spacing w:before="20" w:after="20"/>
-            </w:pPr>
-            <w:r>
-              <w:rPr>
-                <w:b/>
-                <w:color w:val="2563EB"/>
-              </w:rPr>
-              <w:t xml:space="preserve">▸ </w:t>
-            </w:r>
-            <w:r>
-              <w:rPr>
-                <w:color w:val="334155"/>
-                <w:sz w:val="19"/>
-              </w:rPr>
-              <w:t>Normalized relational models: projects, prompts, prompt_executions, web_search_results, brand_mentions, and execution_analyses</w:t>
-            </w:r>
-          </w:p>
-        </w:tc>
-      </w:tr>
-    </w:tbl>
-    <w:p>
-      <w:pPr>
-        <w:spacing w:after="80"/>
-      </w:pPr>
-    </w:p>
-    <w:p>
-      <w:pPr>
-        <w:pStyle w:val="Heading1"/>
-      </w:pPr>
-      <w:r>
-        <w:t>3. Plans &amp; Future Pathway</w:t>
+        <w:t xml:space="preserve"> We create non-branded consumer search queries (e.g., 'best free online graphic design tools' rather than 'Canva') to reflect how actual consumers ask questions without brand bias.</w:t>
       </w:r>
     </w:p>
     <w:p>
       <w:pPr>
-        <w:spacing w:after="120"/>
+        <w:pStyle w:val="ListBullet"/>
+        <w:spacing w:line="276" w:lineRule="auto" w:after="80"/>
       </w:pPr>
       <w:r>
-        <w:t>• Distributed Background Workers (Celery + Redis): Transition from in-process thread pooling to a robust distributed task queue to handle scheduled client monitoring suites (1,000+ prompts nightly).</w:t>
-        <w:br/>
-        <w:t>• Deep Recursive Crawler (Playwright / Crawl4AI): Pair Tavily search with a dedicated headless crawler capable of traversing client sites 4 to 5 levels deep to map internal links and nested blog hierarchies.</w:t>
-        <w:br/>
-        <w:t>• Cross-Model Benchmarking Matrix: Concurrently execute prompt suites across OpenAI GPT-4o Search, Google Gemini 1.5 Pro, and Perplexity Sonar to track cross-engine visibility discrepancies.</w:t>
-        <w:br/>
-        <w:t>• Automated Remediation Agent: Automatically generate actionable content briefs when a brand has 0% mentions on high-intent queries, recommending what data tables and statistics to publish to win citations.</w:t>
+        <w:rPr>
+          <w:b/>
+          <w:color w:val="0F172A"/>
+        </w:rPr>
+        <w:t>Search-Grounded Inference:</w:t>
+      </w:r>
+      <w:r>
+        <w:rPr>
+          <w:color w:val="334155"/>
+        </w:rPr>
+        <w:t xml:space="preserve"> The system runs an autonomous ReAct loop where the model calls Tavily Search, evaluates live web results, synthesizes an answer, and tags factual claims with bracketed citations [X].</w:t>
       </w:r>
     </w:p>
     <w:p>
       <w:pPr>
-        <w:pStyle w:val="Heading1"/>
+        <w:pStyle w:val="ListBullet"/>
+        <w:spacing w:line="276" w:lineRule="auto" w:after="80"/>
       </w:pPr>
       <w:r>
-        <w:t>4. Breaking Points &amp; Bottlenecks Discovered</w:t>
+        <w:rPr>
+          <w:b/>
+          <w:color w:val="0F172A"/>
+        </w:rPr>
+        <w:t>Dual Extraction Pipeline:</w:t>
+      </w:r>
+      <w:r>
+        <w:rPr>
+          <w:color w:val="334155"/>
+        </w:rPr>
+        <w:t xml:space="preserve"> To prevent hallucinations, brand mentions are detected via word-boundary regex and Levenshtein typo matching (0.82 ratio). A secondary Pydantic-constrained LLM call extracts competitor brands and sentiment.</w:t>
       </w:r>
     </w:p>
     <w:p>
       <w:pPr>
-        <w:pStyle w:val="Heading2"/>
+        <w:pStyle w:val="ListBullet"/>
+        <w:spacing w:line="276" w:lineRule="auto" w:after="80"/>
       </w:pPr>
       <w:r>
-        <w:t>4.1 Free-Tier Token Limits &amp; Quota Exhaustion</w:t>
+        <w:rPr>
+          <w:b/>
+          <w:color w:val="0F172A"/>
+        </w:rPr>
+        <w:t>Relational Persistence:</w:t>
+      </w:r>
+      <w:r>
+        <w:rPr>
+          <w:color w:val="334155"/>
+        </w:rPr>
+        <w:t xml:space="preserve"> Executions, cited URLs, search queries, mentions, and sentiment are stored relationally in Neon PostgreSQL and grouped by chronological batches.</w:t>
       </w:r>
     </w:p>
     <w:p>
       <w:pPr>
-        <w:spacing w:after="60"/>
+        <w:spacing w:before="280" w:after="80"/>
       </w:pPr>
       <w:r>
-        <w:t>A single prompt run consumes 3,000 to 4,500 tokens across system instructions, injected search snippets, synthesized answers, and structured extraction. On free-tier API endpoints (OpenRouter/Groq), executing batches of 5 to 10 prompts rapidly exhausted tokens and triggered HTTP 429 (Rate Limit Exceeded) errors. We mitigated this using tenacity exponential backoff retries and dynamic switching to Groq's high-throughput open-source models.</w:t>
+        <w:rPr>
+          <w:b/>
+          <w:color w:val="0F172A"/>
+          <w:sz w:val="30"/>
+        </w:rPr>
+        <w:t>2. Current System Architecture</w:t>
       </w:r>
     </w:p>
     <w:p>
       <w:pPr>
-        <w:pStyle w:val="Heading2"/>
+        <w:spacing w:line="276" w:lineRule="auto" w:after="80"/>
       </w:pPr>
       <w:r>
-        <w:t>4.2 Concurrency Collapse: 5-Worker Fan-Out vs. Sequential Fallback</w:t>
+        <w:rPr>
+          <w:color w:val="334155"/>
+        </w:rPr>
+        <w:t>The current system consists of four primary components connected through defined contracts:</w:t>
       </w:r>
     </w:p>
     <w:p>
       <w:pPr>
-        <w:spacing w:after="60"/>
+        <w:pStyle w:val="ListBullet"/>
+        <w:spacing w:line="276" w:lineRule="auto" w:after="80"/>
       </w:pPr>
       <w:r>
-        <w:t>Our original plan was to fan out 5 parallel worker threads via ThreadPoolExecutor so a 5-prompt batch would finish in ~10 seconds. However, because each worker chains multiple API calls (Tavily search + ReAct LLM + extraction LLM), 5 parallel workers generated 15+ concurrent requests simultaneously. This spiked API rate limits and caused socket failures. To ensure rock-solid stability, we defensively throttled concurrency down to sequential/serialized execution, eliminating crashes but increasing batch run duration to ~45–60 seconds.</w:t>
+        <w:rPr>
+          <w:b/>
+          <w:color w:val="0F172A"/>
+        </w:rPr>
+        <w:t xml:space="preserve">1. Frontend Layer: </w:t>
+      </w:r>
+      <w:r>
+        <w:rPr>
+          <w:color w:val="334155"/>
+        </w:rPr>
+        <w:t xml:space="preserve"> Built with React 19, Vite, and Tailwind CSS. Provides project management, prompt suite creation, dynamic model selection (Groq open-source vs. OpenRouter), batch-first execution explorer, and optimistic deletions.</w:t>
       </w:r>
     </w:p>
     <w:p>
       <w:pPr>
-        <w:pStyle w:val="Heading2"/>
+        <w:pStyle w:val="ListBullet"/>
+        <w:spacing w:line="276" w:lineRule="auto" w:after="80"/>
       </w:pPr>
       <w:r>
-        <w:t>4.3 Tavily Crawling Depth Limits</w:t>
+        <w:rPr>
+          <w:b/>
+          <w:color w:val="0F172A"/>
+        </w:rPr>
+        <w:t xml:space="preserve">2. Backend Service: </w:t>
+      </w:r>
+      <w:r>
+        <w:rPr>
+          <w:color w:val="334155"/>
+        </w:rPr>
+        <w:t xml:space="preserve"> Built with FastAPI and Pydantic v2. Exposes REST endpoints for project creation, prompt variant generation, batch execution dispatch, and historical reporting.</w:t>
       </w:r>
     </w:p>
     <w:p>
       <w:pPr>
-        <w:spacing w:after="60"/>
+        <w:pStyle w:val="ListBullet"/>
+        <w:spacing w:line="276" w:lineRule="auto" w:after="80"/>
       </w:pPr>
       <w:r>
-        <w:t>Tavily functions as an indexed snippet retrieval tool rather than a recursive crawler. For niche B2B or agency domains, key case studies and technical articles are often nested 3 or 4 levels deep in the URL hierarchy. Tavily frequently misses these deep sub-pages and instead returns generic high-level directory aggregators. Toggling search_depth to 'advanced' increased snippet length but did not resolve the crawl depth limitation.</w:t>
+        <w:rPr>
+          <w:b/>
+          <w:color w:val="0F172A"/>
+        </w:rPr>
+        <w:t xml:space="preserve">3. Grounding &amp; AI Engine: </w:t>
+      </w:r>
+      <w:r>
+        <w:rPr>
+          <w:color w:val="334155"/>
+        </w:rPr>
+        <w:t xml:space="preserve"> Connects Tavily Search API for real-time web retrieval and routes LLM requests to OpenRouter (openai/gpt-4o-mini) and Groq (openai/gpt-oss-120b). Formats citations with [X] markers and closing manifests.</w:t>
       </w:r>
     </w:p>
     <w:p>
       <w:pPr>
-        <w:pStyle w:val="Heading2"/>
+        <w:pStyle w:val="ListBullet"/>
+        <w:spacing w:line="276" w:lineRule="auto" w:after="80"/>
       </w:pPr>
       <w:r>
-        <w:t>4.4 The Mention vs. Citation Asymmetry Problem</w:t>
+        <w:rPr>
+          <w:b/>
+          <w:color w:val="0F172A"/>
+        </w:rPr>
+        <w:t xml:space="preserve">4. Data Persistence: </w:t>
+      </w:r>
+      <w:r>
+        <w:rPr>
+          <w:color w:val="334155"/>
+        </w:rPr>
+        <w:t xml:space="preserve"> Serverless Neon PostgreSQL database storing normalized tables: projects, prompts, prompt_executions, web_search_results, brand_mentions, and execution_analyses.</w:t>
       </w:r>
     </w:p>
     <w:p>
       <w:pPr>
-        <w:spacing w:after="60"/>
+        <w:spacing w:before="280" w:after="80"/>
       </w:pPr>
       <w:r>
-        <w:t>Empirical testing revealed a core divergence in generative AI behavior:</w:t>
-        <w:br/>
-        <w:t>• Citations with 0 Mentions: Conceptual prompts ('difference between TCP and UDP') retrieve the domain in grounding citations, but the LLM explains the concept directly without writing the brand name.</w:t>
-        <w:br/>
-        <w:t>• Mentions with 0 Citations: Tool queries ('best online graphic design tools') prompt the LLM to recommend the brand (Canva) #1 in the text, but the search engine cites 3rd-party review listicles rather than the brand's own domain.</w:t>
-        <w:br/>
-        <w:t>Insight: True GEO visibility requires designing queries with commercial or problem-solving intent where both brand authority and domain utility are cited together.</w:t>
+        <w:rPr>
+          <w:b/>
+          <w:color w:val="0F172A"/>
+          <w:sz w:val="30"/>
+        </w:rPr>
+        <w:t>3. Real Breaking Points, Constraints &amp; Bottlenecks Discovered</w:t>
       </w:r>
     </w:p>
     <w:p>
       <w:pPr>
-        <w:pStyle w:val="Heading2"/>
+        <w:spacing w:line="276" w:lineRule="auto" w:after="80"/>
       </w:pPr>
       <w:r>
-        <w:t>4.5 Cumulative Latency &amp; Database Cascade Locking</w:t>
+        <w:rPr>
+          <w:color w:val="334155"/>
+        </w:rPr>
+        <w:t>During live implementation, testing, and evaluation, we discovered several critical engineering constraints, behavioral divergences, and operational bottlenecks:</w:t>
       </w:r>
     </w:p>
     <w:p>
       <w:pPr>
-        <w:spacing w:after="120"/>
+        <w:spacing w:before="200" w:after="60"/>
       </w:pPr>
       <w:r>
-        <w:t>Chaining tool calls, search grounding, and secondary extraction produces an end-to-end latency of 6 to 12 seconds per prompt. Furthermore, deleting executions initially caused UI freezes due to cascading foreign-key deletions across 5 database tables. We eliminated this by removing confirmation popups and implementing Optimistic Deletion in React (instant 0ms card removal with background synchronization).</w:t>
+        <w:rPr>
+          <w:b/>
+          <w:color w:val="1E293B"/>
+          <w:sz w:val="25"/>
+        </w:rPr>
+        <w:t>3.1 Data Volume &amp; Historical Baseline Limitations</w:t>
       </w:r>
     </w:p>
     <w:p>
       <w:pPr>
-        <w:pStyle w:val="Heading1"/>
+        <w:spacing w:line="276" w:lineRule="auto" w:after="80"/>
       </w:pPr>
       <w:r>
+        <w:rPr>
+          <w:color w:val="334155"/>
+        </w:rPr>
+        <w:t>Because the application was built recently, there is no historical baseline data. We cannot yet observe or predict month-over-month visibility drift or algorithm update impacts. Furthermore, our testing capacity is strictly limited to small batches of 5 to 10 prompts per run. Testing larger suites (e.g. 100+ prompts) is currently blocked by free-tier token allowances, rate limits, and latency.</w:t>
+      </w:r>
+    </w:p>
+    <w:p>
+      <w:pPr>
+        <w:spacing w:before="200" w:after="60"/>
+      </w:pPr>
+      <w:r>
+        <w:rPr>
+          <w:b/>
+          <w:color w:val="1E293B"/>
+          <w:sz w:val="25"/>
+        </w:rPr>
+        <w:t>3.2 Multi-Model Tracking &amp; Observability Gaps</w:t>
+      </w:r>
+    </w:p>
+    <w:p>
+      <w:pPr>
+        <w:spacing w:line="276" w:lineRule="auto" w:after="80"/>
+      </w:pPr>
+      <w:r>
+        <w:rPr>
+          <w:color w:val="334155"/>
+        </w:rPr>
+        <w:t>While multiple models are wired up in the UI dropdown, we are not yet running standardized, concurrent multi-model benchmarking. In a complete GEO setup, the exact same prompt suite should be executed simultaneously across ChatGPT, Gemini, Claude, and Perplexity to generate cross-engine comparative visibility scores. Additionally, prompts lack versioning (we cannot track how prompt wording edits impact model recall over time), and the system lacks structured trace logging and per-step latency telemetry.</w:t>
+      </w:r>
+    </w:p>
+    <w:p>
+      <w:pPr>
+        <w:spacing w:before="200" w:after="60"/>
+      </w:pPr>
+      <w:r>
+        <w:rPr>
+          <w:b/>
+          <w:color w:val="1E293B"/>
+          <w:sz w:val="25"/>
+        </w:rPr>
+        <w:t>3.3 Free-Tier Token Depletion &amp; Concurrency Collapse</w:t>
+      </w:r>
+    </w:p>
+    <w:p>
+      <w:pPr>
+        <w:spacing w:line="276" w:lineRule="auto" w:after="80"/>
+      </w:pPr>
+      <w:r>
+        <w:rPr>
+          <w:color w:val="334155"/>
+        </w:rPr>
+        <w:t>Each prompt execution consumes between 3,000 and 4,500 tokens across system instructions, injected web snippets, synthesized answers, and structured extraction. Our original architectural plan was to fan out 5 parallel worker threads via ThreadPoolExecutor so a 5-prompt batch would finish in ~10 seconds. However, because each worker chains multiple API calls (Tavily search + ReAct LLM + extraction LLM), 5 workers generated 15+ concurrent requests simultaneously. On free-tier and shared API tiers, this immediately triggered HTTP 429 (Rate Limit Exceeded) errors and socket crashes. To guarantee execution reliability, we were forced to defensively throttle concurrency down to sequential execution, increasing batch turnaround to ~45–60 seconds.</w:t>
+      </w:r>
+    </w:p>
+    <w:p>
+      <w:pPr>
+        <w:spacing w:before="200" w:after="60"/>
+      </w:pPr>
+      <w:r>
+        <w:rPr>
+          <w:b/>
+          <w:color w:val="1E293B"/>
+          <w:sz w:val="25"/>
+        </w:rPr>
+        <w:t>3.4 Tavily Crawling Depth Limits</w:t>
+      </w:r>
+    </w:p>
+    <w:p>
+      <w:pPr>
+        <w:spacing w:line="276" w:lineRule="auto" w:after="80"/>
+      </w:pPr>
+      <w:r>
+        <w:rPr>
+          <w:color w:val="334155"/>
+        </w:rPr>
+        <w:t>Tavily functions as an indexed snippet retrieval engine rather than a live recursive website crawler. For specialized B2B brands or agencies, critical service offerings, technical case studies, and perspectives are often nested 3 or 4 levels deep in the URL hierarchy. Tavily frequently misses these nested sub-pages and instead returns high-level directory aggregators (e.g. Tracxn, GoodFirms). Toggling search_depth from 'basic' to 'advanced' increased snippet length, but did not resolve the crawling depth limitation.</w:t>
+      </w:r>
+    </w:p>
+    <w:p>
+      <w:pPr>
+        <w:spacing w:before="200" w:after="60"/>
+      </w:pPr>
+      <w:r>
+        <w:rPr>
+          <w:b/>
+          <w:color w:val="1E293B"/>
+          <w:sz w:val="25"/>
+        </w:rPr>
+        <w:t>3.5 The Mention vs. Citation Asymmetry Problem</w:t>
+      </w:r>
+    </w:p>
+    <w:p>
+      <w:pPr>
+        <w:spacing w:line="276" w:lineRule="auto" w:after="80"/>
+      </w:pPr>
+      <w:r>
+        <w:rPr>
+          <w:color w:val="334155"/>
+        </w:rPr>
+        <w:t>Through empirical testing across different brands, we discovered a core divergence in generative AI behavior:</w:t>
+        <w:br/>
+        <w:t>• Pure Conceptual Prompts (e.g. 'difference between TCP and UDP'): Grounding search cites the target domain (e.g. geeksforgeeks.org), but the LLM explains the concept directly without writing the brand name (100% Citation, 0% Mention).</w:t>
+        <w:br/>
+        <w:t>• Tool Recommendation Prompts (e.g. 'best free graphic design tools'): The LLM names the brand (Canva) #1 in its answer text, but grounding search cites 3rd-party review listicles rather than the brand's own domain (100% Mention, 0% Domain Citation).</w:t>
+        <w:br/>
+        <w:t>Conclusion: Tracking true GEO visibility requires categorizing queries into informational vs. commercial intent to understand where a brand is losing presence.</w:t>
+      </w:r>
+    </w:p>
+    <w:p>
+      <w:pPr>
+        <w:spacing w:before="280" w:after="80"/>
+      </w:pPr>
+      <w:r>
+        <w:rPr>
+          <w:b/>
+          <w:color w:val="0F172A"/>
+          <w:sz w:val="30"/>
+        </w:rPr>
+        <w:t>4. Codebase Technical Debt &amp; Architectural Bottlenecks</w:t>
+      </w:r>
+    </w:p>
+    <w:p>
+      <w:pPr>
+        <w:spacing w:line="276" w:lineRule="auto" w:after="80"/>
+      </w:pPr>
+      <w:r>
+        <w:rPr>
+          <w:color w:val="334155"/>
+        </w:rPr>
+        <w:t>An honest assessment of our current codebase reveals specific technical debt and architecture issues that must be refactored before scaling:</w:t>
+      </w:r>
+    </w:p>
+    <w:p>
+      <w:pPr>
+        <w:spacing w:before="200" w:after="60"/>
+      </w:pPr>
+      <w:r>
+        <w:rPr>
+          <w:b/>
+          <w:color w:val="1E293B"/>
+          <w:sz w:val="25"/>
+        </w:rPr>
+        <w:t>4.1 Heavy Application-Side Computing in /projects/{id}/summary</w:t>
+      </w:r>
+    </w:p>
+    <w:p>
+      <w:pPr>
+        <w:spacing w:line="276" w:lineRule="auto" w:after="80"/>
+      </w:pPr>
+      <w:r>
+        <w:rPr>
+          <w:color w:val="334155"/>
+        </w:rPr>
+        <w:t>Our summary endpoint (/projects/{id}/summary) currently loads every single execution record for a project from PostgreSQL into Python memory. The server then iterates over all executions in Python to compute visibility percentages, domain retrieval counts, citation rates, and sentiment distributions. While fast for 10 runs, this approach will degrade severely at 1,000+ executions. This computing must be shifted to SQL aggregation queries, database views, or pre-computed rollups.</w:t>
+      </w:r>
+    </w:p>
+    <w:p>
+      <w:pPr>
+        <w:spacing w:before="200" w:after="60"/>
+      </w:pPr>
+      <w:r>
+        <w:rPr>
+          <w:b/>
+          <w:color w:val="1E293B"/>
+          <w:sz w:val="25"/>
+        </w:rPr>
+        <w:t>4.2 The N+1 Database Query Problem</w:t>
+      </w:r>
+    </w:p>
+    <w:p>
+      <w:pPr>
+        <w:spacing w:line="276" w:lineRule="auto" w:after="80"/>
+      </w:pPr>
+      <w:r>
+        <w:rPr>
+          <w:color w:val="334155"/>
+        </w:rPr>
+        <w:t>In our results endpoint, fetching a project's executions triggers chained lazy loading across multiple relationships: prompts, search_queries, web_search_results, brand_mentions, and execution_analyses. Instead of executing a single optimized query with SQL JOINs, the application executes 1 initial query + N queries for prompts + N queries for search results + N queries for mentions. This creates unnecessary database connection overhead and network roundtrips to Neon PostgreSQL.</w:t>
+      </w:r>
+    </w:p>
+    <w:p>
+      <w:pPr>
+        <w:spacing w:before="200" w:after="60"/>
+      </w:pPr>
+      <w:r>
+        <w:rPr>
+          <w:b/>
+          <w:color w:val="1E293B"/>
+          <w:sz w:val="25"/>
+        </w:rPr>
+        <w:t>4.3 Monolithic Endpoints &amp; Over-Fetching</w:t>
+      </w:r>
+    </w:p>
+    <w:p>
+      <w:pPr>
+        <w:spacing w:line="276" w:lineRule="auto" w:after="80"/>
+      </w:pPr>
+      <w:r>
+        <w:rPr>
+          <w:color w:val="334155"/>
+        </w:rPr>
+        <w:t>Several API endpoints currently return bloated payloads containing 10 different types of data at once. The system needs granular, purpose-built endpoints so the frontend only fetches the exact slice of data needed for the active view.</w:t>
+      </w:r>
+    </w:p>
+    <w:p>
+      <w:pPr>
+        <w:spacing w:before="200" w:after="60"/>
+      </w:pPr>
+      <w:r>
+        <w:rPr>
+          <w:b/>
+          <w:color w:val="1E293B"/>
+          <w:sz w:val="25"/>
+        </w:rPr>
+        <w:t>4.4 Frontend Monolith (App.jsx) &amp; Generic Routing</w:t>
+      </w:r>
+    </w:p>
+    <w:p>
+      <w:pPr>
+        <w:spacing w:line="276" w:lineRule="auto" w:after="80"/>
+      </w:pPr>
+      <w:r>
+        <w:rPr>
+          <w:color w:val="334155"/>
+        </w:rPr>
+        <w:t>Currently, App.jsx handles state management, API data fetching, modal toggles, polling, and view rendering in a single large file. It needs to be refactored into modular custom hooks and focused components. Furthermore, the application uses a generic /dashboard route for all views. Routing must be made project-specific (e.g., /dashboard/:projectId or /projects/:projectId) to allow bookmarking, deep-linking, and cleaner state synchronization.</w:t>
+      </w:r>
+    </w:p>
+    <w:p>
+      <w:pPr>
+        <w:spacing w:before="280" w:after="80"/>
+      </w:pPr>
+      <w:r>
+        <w:rPr>
+          <w:b/>
+          <w:color w:val="0F172A"/>
+          <w:sz w:val="30"/>
+        </w:rPr>
         <w:t>5. What We Learned (SEO &amp; GEO Insights)</w:t>
       </w:r>
     </w:p>
     <w:p>
       <w:pPr>
-        <w:spacing w:after="80"/>
+        <w:spacing w:line="276" w:lineRule="auto" w:after="80"/>
       </w:pPr>
       <w:r>
-        <w:t>1. Traditional SEO vs. GEO: Traditional SEO optimizes for deterministic Googlebot crawlers, keyword density, and blue link rankings (#1–#10). GEO optimizes for probabilistic LLM knowledge synthesis, entity relationships, and Share of Model (SoM).</w:t>
+        <w:rPr>
+          <w:color w:val="334155"/>
+        </w:rPr>
+        <w:t>1. Traditional SEO vs. Generative Engine Optimization (GEO): Traditional SEO optimizes for Googlebot crawlers, keyword density, and blue link rankings (#1–#10). GEO optimizes for probabilistic LLM knowledge synthesis, entity relationships, and Share of Model (SoM).</w:t>
         <w:br/>
         <w:br/>
-        <w:t>2. Zero-Click Search Defense: AI Overviews answer user questions directly on the SERP, leading to steep drops in organic website clicks. GEO ensures a brand protects its market presence by being featured and favorably credited directly inside the synthesized AI response.</w:t>
+        <w:t>2. Zero-Click Search Defense: AI Overviews answer user questions directly on the search results page, leading to significant declines in organic website click-through rates. GEO is a defensive discipline: ensuring a brand is credited and recommended directly inside the synthesized AI answer itself.</w:t>
         <w:br/>
         <w:br/>
-        <w:t>3. Entity Salience Over Keyword Stuffing: Large language models retrieve brands based on vector proximity in knowledge graphs. A brand must have dense semantic co-occurrence with its problem domain across authoritative third-party sources to be recommended for non-branded queries.</w:t>
+        <w:t>3. Entity Salience Over Keywords: Large language models do not match keywords; they retrieve entities based on vector proximity in knowledge graphs. A brand must have dense semantic association with its category across authoritative digital corpora to appear in non-branded queries.</w:t>
         <w:br/>
         <w:br/>
-        <w:t>4. Information Gain Wins Citations: Retrieval engines powering AI search prioritize content with high fact density—such as structured comparison tables, verified numerical data, and direct technical definitions—over subjective marketing prose.</w:t>
+        <w:t>4. Information Gain and Quotability Win Citations: Search retrieval engines powering AI answers prioritize content with high fact density—such as structured comparison tables, verified statistics, and direct definitions—over generic marketing prose.</w:t>
+      </w:r>
+    </w:p>
+    <w:p>
+      <w:pPr>
+        <w:spacing w:before="280" w:after="80"/>
+      </w:pPr>
+      <w:r>
+        <w:rPr>
+          <w:b/>
+          <w:color w:val="0F172A"/>
+          <w:sz w:val="30"/>
+        </w:rPr>
+        <w:t>6. Future Implementation Plan &amp; Technical Roadmap</w:t>
+      </w:r>
+    </w:p>
+    <w:p>
+      <w:pPr>
+        <w:spacing w:line="276" w:lineRule="auto" w:after="80"/>
+      </w:pPr>
+      <w:r>
+        <w:rPr>
+          <w:color w:val="334155"/>
+        </w:rPr>
+        <w:t>To evolve PromptPulse from a working POC into a production-grade monitoring platform, our engineering roadmap focuses on six key initiatives:</w:t>
+      </w:r>
+    </w:p>
+    <w:p>
+      <w:pPr>
+        <w:pStyle w:val="ListBullet"/>
+        <w:spacing w:line="276" w:lineRule="auto" w:after="80"/>
+      </w:pPr>
+      <w:r>
+        <w:rPr>
+          <w:b/>
+          <w:color w:val="0F172A"/>
+        </w:rPr>
+        <w:t>1. Database Optimization &amp; Eager Loading:</w:t>
+      </w:r>
+      <w:r>
+        <w:rPr>
+          <w:color w:val="334155"/>
+        </w:rPr>
+        <w:t xml:space="preserve"> Eliminate the N+1 query problem in backend/app/api/results.py by using SQLAlchemy joinedload and selectinload to fetch executions, prompts, and citations in a single database roundtrip.</w:t>
+      </w:r>
+    </w:p>
+    <w:p>
+      <w:pPr>
+        <w:pStyle w:val="ListBullet"/>
+        <w:spacing w:line="276" w:lineRule="auto" w:after="80"/>
+      </w:pPr>
+      <w:r>
+        <w:rPr>
+          <w:b/>
+          <w:color w:val="0F172A"/>
+        </w:rPr>
+        <w:t>2. Redis Caching Layer:</w:t>
+      </w:r>
+      <w:r>
+        <w:rPr>
+          <w:color w:val="334155"/>
+        </w:rPr>
+        <w:t xml:space="preserve"> Implement Redis caching for project summary endpoints, citation audit tables, and API rate-limiting counters. Summary metrics will be updated via cached rollups rather than recomputed across all rows on every page load.</w:t>
+      </w:r>
+    </w:p>
+    <w:p>
+      <w:pPr>
+        <w:pStyle w:val="ListBullet"/>
+        <w:spacing w:line="276" w:lineRule="auto" w:after="80"/>
+      </w:pPr>
+      <w:r>
+        <w:rPr>
+          <w:b/>
+          <w:color w:val="0F172A"/>
+        </w:rPr>
+        <w:t>3. Distributed Worker Architecture (Celery + Redis):</w:t>
+      </w:r>
+      <w:r>
+        <w:rPr>
+          <w:color w:val="334155"/>
+        </w:rPr>
+        <w:t xml:space="preserve"> Replace in-process ThreadPoolExecutor with Celery and Redis worker queues. This enables scheduled background batch runs (e.g. 500 prompts nightly per client) with token-bucket rate limiters.</w:t>
+      </w:r>
+    </w:p>
+    <w:p>
+      <w:pPr>
+        <w:pStyle w:val="ListBullet"/>
+        <w:spacing w:line="276" w:lineRule="auto" w:after="80"/>
+      </w:pPr>
+      <w:r>
+        <w:rPr>
+          <w:b/>
+          <w:color w:val="0F172A"/>
+        </w:rPr>
+        <w:t>4. Deep Recursive Web Crawler:</w:t>
+      </w:r>
+      <w:r>
+        <w:rPr>
+          <w:color w:val="334155"/>
+        </w:rPr>
+        <w:t xml:space="preserve"> Complement Tavily search with a dedicated headless browser crawler (Playwright / Crawl4AI) capable of crawling 4 levels deep into client websites to index nested service pages and case studies.</w:t>
+      </w:r>
+    </w:p>
+    <w:p>
+      <w:pPr>
+        <w:pStyle w:val="ListBullet"/>
+        <w:spacing w:line="276" w:lineRule="auto" w:after="80"/>
+      </w:pPr>
+      <w:r>
+        <w:rPr>
+          <w:b/>
+          <w:color w:val="0F172A"/>
+        </w:rPr>
+        <w:t>5. Frontend Modularization &amp; RESTful Routing:</w:t>
+      </w:r>
+      <w:r>
+        <w:rPr>
+          <w:color w:val="334155"/>
+        </w:rPr>
+        <w:t xml:space="preserve"> Split App.jsx into dedicated custom hooks (useProjects, useRuns, useBatchExecution) and implement React Router with project-specific URLs (/projects/:projectId).</w:t>
+      </w:r>
+    </w:p>
+    <w:p>
+      <w:pPr>
+        <w:pStyle w:val="ListBullet"/>
+        <w:spacing w:line="276" w:lineRule="auto" w:after="80"/>
+      </w:pPr>
+      <w:r>
+        <w:rPr>
+          <w:b/>
+          <w:color w:val="0F172A"/>
+        </w:rPr>
+        <w:t>6. Multi-Model Benchmarking Matrix:</w:t>
+      </w:r>
+      <w:r>
+        <w:rPr>
+          <w:color w:val="334155"/>
+        </w:rPr>
+        <w:t xml:space="preserve"> Build a benchmarking engine that executes the same prompt suite concurrently across OpenAI GPT-4o Search, Google Gemini 1.5 Pro, Anthropic Claude 3.5, and Perplexity to generate cross-engine visibility comparisons.</w:t>
       </w:r>
     </w:p>
     <w:sectPr>
       <w:pgSz w:w="12240" w:h="15840"/>
-      <w:pgMar w:top="1008" w:right="1152" w:bottom="1008" w:left="1152" w:header="720" w:footer="720" w:gutter="0"/>
+      <w:pgMar w:top="1440" w:right="1440" w:bottom="1440" w:left="1440" w:header="720" w:footer="720" w:gutter="0"/>
       <w:cols w:space="720"/>
       <w:docGrid w:linePitch="360"/>
     </w:sectPr>
@@ -1065,7 +1055,7 @@
     <w:rPr>
       <w:rFonts w:ascii="Calibri" w:hAnsi="Calibri"/>
       <w:color w:val="1E293B"/>
-      <w:sz w:val="20"/>
+      <w:sz w:val="22"/>
     </w:rPr>
   </w:style>
   <w:style w:type="paragraph" w:styleId="Header">
@@ -1130,7 +1120,7 @@
       <w:rFonts w:asciiTheme="majorHAnsi" w:eastAsiaTheme="majorEastAsia" w:hAnsiTheme="majorHAnsi" w:cstheme="majorBidi"/>
       <w:b/>
       <w:bCs/>
-      <w:color w:val="0F172A"/>
+      <w:color w:val="365F91" w:themeColor="accent1" w:themeShade="BF"/>
       <w:sz w:val="28"/>
       <w:szCs w:val="28"/>
     </w:rPr>

</xml_diff>

<commit_message>
docs: streamline discussion document to precise scope (SEO, GEO, Backend, AI)
</commit_message>
<xml_diff>
--- a/RankUno_POC_Discussion_Document.docx
+++ b/RankUno_POC_Discussion_Document.docx
@@ -12,19 +12,20 @@
           <w:color w:val="0F172A"/>
           <w:sz w:val="36"/>
         </w:rPr>
-        <w:t>PromptPulse: Technical Approach, Architecture &amp; Learning Review</w:t>
+        <w:t>PromptPulse: POC Technical Review &amp; Discussion</w:t>
       </w:r>
     </w:p>
     <w:p>
       <w:pPr>
-        <w:spacing w:before="0" w:after="280"/>
+        <w:spacing w:before="0" w:after="240"/>
       </w:pPr>
       <w:r>
         <w:rPr>
+          <w:i/>
           <w:color w:val="64748B"/>
-          <w:sz w:val="23"/>
+          <w:sz w:val="22"/>
         </w:rPr>
-        <w:t>POC Discussion Document — Engineering Bottlenecks, SEO/GEO Insights &amp; Implementation Plan</w:t>
+        <w:t>Engineering Approach, System Architecture, Bottlenecks &amp; SEO/GEO Insights</w:t>
       </w:r>
     </w:p>
     <w:p>
@@ -35,7 +36,7 @@
         <w:rPr>
           <w:b/>
           <w:color w:val="0F172A"/>
-          <w:sz w:val="30"/>
+          <w:sz w:val="28"/>
         </w:rPr>
         <w:t>1. How We Approached the Problem</w:t>
       </w:r>
@@ -48,7 +49,7 @@
         <w:rPr>
           <w:color w:val="334155"/>
         </w:rPr>
-        <w:t>Search behavior is fundamentally shifting from traditional search engines (ten blue links) to generative AI answer engines like ChatGPT Search, Perplexity, Google AI Overviews, and Gemini. Traditional SEO tools measure keyword rankings (#1 to #10) and backlink volume, which provides zero visibility into whether an AI model mentions, recommends, compares, or cites a brand.</w:t>
+        <w:t>As user search habits transition from traditional search engines (ten blue links) to generative AI engines (ChatGPT Search, Perplexity, Google AI Overviews), brand visibility is no longer defined by SERP rank #1–10. Instead, visibility depends on whether an AI system mentions, recommends, compares, or cites a brand during response generation.</w:t>
       </w:r>
     </w:p>
     <w:p>
@@ -59,7 +60,7 @@
         <w:rPr>
           <w:color w:val="334155"/>
         </w:rPr>
-        <w:t>We built PromptPulse (addressing Problem Statement A: GEO Prompt &amp; Brand Visibility Tracker) to track brand presence inside AI-generated answers through an end-to-end workflow:</w:t>
+        <w:t>We built PromptPulse to evaluate and monitor brand presence inside AI-generated answers through an automated pipeline:</w:t>
       </w:r>
     </w:p>
     <w:p>
@@ -78,7 +79,7 @@
         <w:rPr>
           <w:color w:val="334155"/>
         </w:rPr>
-        <w:t xml:space="preserve"> We create non-branded consumer search queries (e.g., 'best free online graphic design tools' rather than 'Canva') to reflect how actual consumers ask questions without brand bias.</w:t>
+        <w:t xml:space="preserve"> We create non-branded consumer search queries (e.g., 'best free online graphic design tools' rather than 'Canva') to test how models respond to real consumer intent without brand bias.</w:t>
       </w:r>
     </w:p>
     <w:p>
@@ -97,7 +98,7 @@
         <w:rPr>
           <w:color w:val="334155"/>
         </w:rPr>
-        <w:t xml:space="preserve"> The system runs an autonomous ReAct loop where the model calls Tavily Search, evaluates live web results, synthesizes an answer, and tags factual claims with bracketed citations [X].</w:t>
+        <w:t xml:space="preserve"> An autonomous ReAct loop retrieves real-time web evidence via Tavily Search, synthesizes an answer, and maps factual claims to bracketed citation markers [X].</w:t>
       </w:r>
     </w:p>
     <w:p>
@@ -116,7 +117,7 @@
         <w:rPr>
           <w:color w:val="334155"/>
         </w:rPr>
-        <w:t xml:space="preserve"> To prevent hallucinations, brand mentions are detected via word-boundary regex and Levenshtein typo matching (0.82 ratio). A secondary Pydantic-constrained LLM call extracts competitor brands and sentiment.</w:t>
+        <w:t xml:space="preserve"> Mentions are detected deterministically using word-boundary regex with Levenshtein typo tolerance, combined with an LLM call to extract competitor presence and sentiment.</w:t>
       </w:r>
     </w:p>
     <w:p>
@@ -129,13 +130,13 @@
           <w:b/>
           <w:color w:val="0F172A"/>
         </w:rPr>
-        <w:t>Relational Persistence:</w:t>
+        <w:t>Relational Tracking:</w:t>
       </w:r>
       <w:r>
         <w:rPr>
           <w:color w:val="334155"/>
         </w:rPr>
-        <w:t xml:space="preserve"> Executions, cited URLs, search queries, mentions, and sentiment are stored relationally in Neon PostgreSQL and grouped by chronological batches.</w:t>
+        <w:t xml:space="preserve"> Executions, queries, cited domains, and metrics are stored relationally in PostgreSQL to track performance across execution batches.</w:t>
       </w:r>
     </w:p>
     <w:p>
@@ -146,7 +147,7 @@
         <w:rPr>
           <w:b/>
           <w:color w:val="0F172A"/>
-          <w:sz w:val="30"/>
+          <w:sz w:val="28"/>
         </w:rPr>
         <w:t>2. Current System Architecture</w:t>
       </w:r>
@@ -159,7 +160,7 @@
         <w:rPr>
           <w:color w:val="334155"/>
         </w:rPr>
-        <w:t>The current system consists of four primary components connected through defined contracts:</w:t>
+        <w:t>The system architecture connects four core layers into a streamlined execution pipeline:</w:t>
       </w:r>
     </w:p>
     <w:p>
@@ -172,13 +173,13 @@
           <w:b/>
           <w:color w:val="0F172A"/>
         </w:rPr>
-        <w:t xml:space="preserve">1. Frontend Layer: </w:t>
+        <w:t>Frontend Layer:</w:t>
       </w:r>
       <w:r>
         <w:rPr>
           <w:color w:val="334155"/>
         </w:rPr>
-        <w:t xml:space="preserve"> Built with React 19, Vite, and Tailwind CSS. Provides project management, prompt suite creation, dynamic model selection (Groq open-source vs. OpenRouter), batch-first execution explorer, and optimistic deletions.</w:t>
+        <w:t xml:space="preserve"> Built with React 19 and Tailwind CSS. Provides project management, prompt suite authoring, dynamic model selection (Groq open-source vs. OpenRouter), and batch execution monitoring.</w:t>
       </w:r>
     </w:p>
     <w:p>
@@ -191,13 +192,13 @@
           <w:b/>
           <w:color w:val="0F172A"/>
         </w:rPr>
-        <w:t xml:space="preserve">2. Backend Service: </w:t>
+        <w:t>Backend API Service:</w:t>
       </w:r>
       <w:r>
         <w:rPr>
           <w:color w:val="334155"/>
         </w:rPr>
-        <w:t xml:space="preserve"> Built with FastAPI and Pydantic v2. Exposes REST endpoints for project creation, prompt variant generation, batch execution dispatch, and historical reporting.</w:t>
+        <w:t xml:space="preserve"> Built with FastAPI and Pydantic v2. Exposes REST endpoints to manage projects, generate prompt variants, trigger execution batches, and deliver aggregated analytics.</w:t>
       </w:r>
     </w:p>
     <w:p>
@@ -210,13 +211,13 @@
           <w:b/>
           <w:color w:val="0F172A"/>
         </w:rPr>
-        <w:t xml:space="preserve">3. Grounding &amp; AI Engine: </w:t>
+        <w:t>AI &amp; Grounding Engine:</w:t>
       </w:r>
       <w:r>
         <w:rPr>
           <w:color w:val="334155"/>
         </w:rPr>
-        <w:t xml:space="preserve"> Connects Tavily Search API for real-time web retrieval and routes LLM requests to OpenRouter (openai/gpt-4o-mini) and Groq (openai/gpt-oss-120b). Formats citations with [X] markers and closing manifests.</w:t>
+        <w:t xml:space="preserve"> Coordinates live web retrieval through Tavily Search API, feeds context to LLMs (OpenRouter/Groq) for answer synthesis with source grounding, and parses citation manifests.</w:t>
       </w:r>
     </w:p>
     <w:p>
@@ -229,13 +230,13 @@
           <w:b/>
           <w:color w:val="0F172A"/>
         </w:rPr>
-        <w:t xml:space="preserve">4. Data Persistence: </w:t>
+        <w:t>Database Persistence:</w:t>
       </w:r>
       <w:r>
         <w:rPr>
           <w:color w:val="334155"/>
         </w:rPr>
-        <w:t xml:space="preserve"> Serverless Neon PostgreSQL database storing normalized tables: projects, prompts, prompt_executions, web_search_results, brand_mentions, and execution_analyses.</w:t>
+        <w:t xml:space="preserve"> Serverless Neon PostgreSQL database storing normalized tables for projects, prompts, executions, web results, brand mentions, and sentiment analysis.</w:t>
       </w:r>
     </w:p>
     <w:p>
@@ -246,9 +247,9 @@
         <w:rPr>
           <w:b/>
           <w:color w:val="0F172A"/>
-          <w:sz w:val="30"/>
+          <w:sz w:val="28"/>
         </w:rPr>
-        <w:t>3. Real Breaking Points, Constraints &amp; Bottlenecks Discovered</w:t>
+        <w:t>3. Breaking Points &amp; Bottlenecks Discovered</w:t>
       </w:r>
     </w:p>
     <w:p>
@@ -259,310 +260,20 @@
         <w:rPr>
           <w:color w:val="334155"/>
         </w:rPr>
-        <w:t>During live implementation, testing, and evaluation, we discovered several critical engineering constraints, behavioral divergences, and operational bottlenecks:</w:t>
+        <w:t>During development and live testing, we identified key bottlenecks and constraints directly within what we built:</w:t>
       </w:r>
     </w:p>
     <w:p>
       <w:pPr>
-        <w:spacing w:before="200" w:after="60"/>
+        <w:spacing w:before="160" w:after="40"/>
       </w:pPr>
       <w:r>
         <w:rPr>
           <w:b/>
           <w:color w:val="1E293B"/>
-          <w:sz w:val="25"/>
+          <w:sz w:val="24"/>
         </w:rPr>
-        <w:t>3.1 Data Volume &amp; Historical Baseline Limitations</w:t>
-      </w:r>
-    </w:p>
-    <w:p>
-      <w:pPr>
-        <w:spacing w:line="276" w:lineRule="auto" w:after="80"/>
-      </w:pPr>
-      <w:r>
-        <w:rPr>
-          <w:color w:val="334155"/>
-        </w:rPr>
-        <w:t>Because the application was built recently, there is no historical baseline data. We cannot yet observe or predict month-over-month visibility drift or algorithm update impacts. Furthermore, our testing capacity is strictly limited to small batches of 5 to 10 prompts per run. Testing larger suites (e.g. 100+ prompts) is currently blocked by free-tier token allowances, rate limits, and latency.</w:t>
-      </w:r>
-    </w:p>
-    <w:p>
-      <w:pPr>
-        <w:spacing w:before="200" w:after="60"/>
-      </w:pPr>
-      <w:r>
-        <w:rPr>
-          <w:b/>
-          <w:color w:val="1E293B"/>
-          <w:sz w:val="25"/>
-        </w:rPr>
-        <w:t>3.2 Multi-Model Tracking &amp; Observability Gaps</w:t>
-      </w:r>
-    </w:p>
-    <w:p>
-      <w:pPr>
-        <w:spacing w:line="276" w:lineRule="auto" w:after="80"/>
-      </w:pPr>
-      <w:r>
-        <w:rPr>
-          <w:color w:val="334155"/>
-        </w:rPr>
-        <w:t>While multiple models are wired up in the UI dropdown, we are not yet running standardized, concurrent multi-model benchmarking. In a complete GEO setup, the exact same prompt suite should be executed simultaneously across ChatGPT, Gemini, Claude, and Perplexity to generate cross-engine comparative visibility scores. Additionally, prompts lack versioning (we cannot track how prompt wording edits impact model recall over time), and the system lacks structured trace logging and per-step latency telemetry.</w:t>
-      </w:r>
-    </w:p>
-    <w:p>
-      <w:pPr>
-        <w:spacing w:before="200" w:after="60"/>
-      </w:pPr>
-      <w:r>
-        <w:rPr>
-          <w:b/>
-          <w:color w:val="1E293B"/>
-          <w:sz w:val="25"/>
-        </w:rPr>
-        <w:t>3.3 Free-Tier Token Depletion &amp; Concurrency Collapse</w:t>
-      </w:r>
-    </w:p>
-    <w:p>
-      <w:pPr>
-        <w:spacing w:line="276" w:lineRule="auto" w:after="80"/>
-      </w:pPr>
-      <w:r>
-        <w:rPr>
-          <w:color w:val="334155"/>
-        </w:rPr>
-        <w:t>Each prompt execution consumes between 3,000 and 4,500 tokens across system instructions, injected web snippets, synthesized answers, and structured extraction. Our original architectural plan was to fan out 5 parallel worker threads via ThreadPoolExecutor so a 5-prompt batch would finish in ~10 seconds. However, because each worker chains multiple API calls (Tavily search + ReAct LLM + extraction LLM), 5 workers generated 15+ concurrent requests simultaneously. On free-tier and shared API tiers, this immediately triggered HTTP 429 (Rate Limit Exceeded) errors and socket crashes. To guarantee execution reliability, we were forced to defensively throttle concurrency down to sequential execution, increasing batch turnaround to ~45–60 seconds.</w:t>
-      </w:r>
-    </w:p>
-    <w:p>
-      <w:pPr>
-        <w:spacing w:before="200" w:after="60"/>
-      </w:pPr>
-      <w:r>
-        <w:rPr>
-          <w:b/>
-          <w:color w:val="1E293B"/>
-          <w:sz w:val="25"/>
-        </w:rPr>
-        <w:t>3.4 Tavily Crawling Depth Limits</w:t>
-      </w:r>
-    </w:p>
-    <w:p>
-      <w:pPr>
-        <w:spacing w:line="276" w:lineRule="auto" w:after="80"/>
-      </w:pPr>
-      <w:r>
-        <w:rPr>
-          <w:color w:val="334155"/>
-        </w:rPr>
-        <w:t>Tavily functions as an indexed snippet retrieval engine rather than a live recursive website crawler. For specialized B2B brands or agencies, critical service offerings, technical case studies, and perspectives are often nested 3 or 4 levels deep in the URL hierarchy. Tavily frequently misses these nested sub-pages and instead returns high-level directory aggregators (e.g. Tracxn, GoodFirms). Toggling search_depth from 'basic' to 'advanced' increased snippet length, but did not resolve the crawling depth limitation.</w:t>
-      </w:r>
-    </w:p>
-    <w:p>
-      <w:pPr>
-        <w:spacing w:before="200" w:after="60"/>
-      </w:pPr>
-      <w:r>
-        <w:rPr>
-          <w:b/>
-          <w:color w:val="1E293B"/>
-          <w:sz w:val="25"/>
-        </w:rPr>
-        <w:t>3.5 The Mention vs. Citation Asymmetry Problem</w:t>
-      </w:r>
-    </w:p>
-    <w:p>
-      <w:pPr>
-        <w:spacing w:line="276" w:lineRule="auto" w:after="80"/>
-      </w:pPr>
-      <w:r>
-        <w:rPr>
-          <w:color w:val="334155"/>
-        </w:rPr>
-        <w:t>Through empirical testing across different brands, we discovered a core divergence in generative AI behavior:</w:t>
-        <w:br/>
-        <w:t>• Pure Conceptual Prompts (e.g. 'difference between TCP and UDP'): Grounding search cites the target domain (e.g. geeksforgeeks.org), but the LLM explains the concept directly without writing the brand name (100% Citation, 0% Mention).</w:t>
-        <w:br/>
-        <w:t>• Tool Recommendation Prompts (e.g. 'best free graphic design tools'): The LLM names the brand (Canva) #1 in its answer text, but grounding search cites 3rd-party review listicles rather than the brand's own domain (100% Mention, 0% Domain Citation).</w:t>
-        <w:br/>
-        <w:t>Conclusion: Tracking true GEO visibility requires categorizing queries into informational vs. commercial intent to understand where a brand is losing presence.</w:t>
-      </w:r>
-    </w:p>
-    <w:p>
-      <w:pPr>
-        <w:spacing w:before="280" w:after="80"/>
-      </w:pPr>
-      <w:r>
-        <w:rPr>
-          <w:b/>
-          <w:color w:val="0F172A"/>
-          <w:sz w:val="30"/>
-        </w:rPr>
-        <w:t>4. Codebase Technical Debt &amp; Architectural Bottlenecks</w:t>
-      </w:r>
-    </w:p>
-    <w:p>
-      <w:pPr>
-        <w:spacing w:line="276" w:lineRule="auto" w:after="80"/>
-      </w:pPr>
-      <w:r>
-        <w:rPr>
-          <w:color w:val="334155"/>
-        </w:rPr>
-        <w:t>An honest assessment of our current codebase reveals specific technical debt and architecture issues that must be refactored before scaling:</w:t>
-      </w:r>
-    </w:p>
-    <w:p>
-      <w:pPr>
-        <w:spacing w:before="200" w:after="60"/>
-      </w:pPr>
-      <w:r>
-        <w:rPr>
-          <w:b/>
-          <w:color w:val="1E293B"/>
-          <w:sz w:val="25"/>
-        </w:rPr>
-        <w:t>4.1 Heavy Application-Side Computing in /projects/{id}/summary</w:t>
-      </w:r>
-    </w:p>
-    <w:p>
-      <w:pPr>
-        <w:spacing w:line="276" w:lineRule="auto" w:after="80"/>
-      </w:pPr>
-      <w:r>
-        <w:rPr>
-          <w:color w:val="334155"/>
-        </w:rPr>
-        <w:t>Our summary endpoint (/projects/{id}/summary) currently loads every single execution record for a project from PostgreSQL into Python memory. The server then iterates over all executions in Python to compute visibility percentages, domain retrieval counts, citation rates, and sentiment distributions. While fast for 10 runs, this approach will degrade severely at 1,000+ executions. This computing must be shifted to SQL aggregation queries, database views, or pre-computed rollups.</w:t>
-      </w:r>
-    </w:p>
-    <w:p>
-      <w:pPr>
-        <w:spacing w:before="200" w:after="60"/>
-      </w:pPr>
-      <w:r>
-        <w:rPr>
-          <w:b/>
-          <w:color w:val="1E293B"/>
-          <w:sz w:val="25"/>
-        </w:rPr>
-        <w:t>4.2 The N+1 Database Query Problem</w:t>
-      </w:r>
-    </w:p>
-    <w:p>
-      <w:pPr>
-        <w:spacing w:line="276" w:lineRule="auto" w:after="80"/>
-      </w:pPr>
-      <w:r>
-        <w:rPr>
-          <w:color w:val="334155"/>
-        </w:rPr>
-        <w:t>In our results endpoint, fetching a project's executions triggers chained lazy loading across multiple relationships: prompts, search_queries, web_search_results, brand_mentions, and execution_analyses. Instead of executing a single optimized query with SQL JOINs, the application executes 1 initial query + N queries for prompts + N queries for search results + N queries for mentions. This creates unnecessary database connection overhead and network roundtrips to Neon PostgreSQL.</w:t>
-      </w:r>
-    </w:p>
-    <w:p>
-      <w:pPr>
-        <w:spacing w:before="200" w:after="60"/>
-      </w:pPr>
-      <w:r>
-        <w:rPr>
-          <w:b/>
-          <w:color w:val="1E293B"/>
-          <w:sz w:val="25"/>
-        </w:rPr>
-        <w:t>4.3 Monolithic Endpoints &amp; Over-Fetching</w:t>
-      </w:r>
-    </w:p>
-    <w:p>
-      <w:pPr>
-        <w:spacing w:line="276" w:lineRule="auto" w:after="80"/>
-      </w:pPr>
-      <w:r>
-        <w:rPr>
-          <w:color w:val="334155"/>
-        </w:rPr>
-        <w:t>Several API endpoints currently return bloated payloads containing 10 different types of data at once. The system needs granular, purpose-built endpoints so the frontend only fetches the exact slice of data needed for the active view.</w:t>
-      </w:r>
-    </w:p>
-    <w:p>
-      <w:pPr>
-        <w:spacing w:before="200" w:after="60"/>
-      </w:pPr>
-      <w:r>
-        <w:rPr>
-          <w:b/>
-          <w:color w:val="1E293B"/>
-          <w:sz w:val="25"/>
-        </w:rPr>
-        <w:t>4.4 Frontend Monolith (App.jsx) &amp; Generic Routing</w:t>
-      </w:r>
-    </w:p>
-    <w:p>
-      <w:pPr>
-        <w:spacing w:line="276" w:lineRule="auto" w:after="80"/>
-      </w:pPr>
-      <w:r>
-        <w:rPr>
-          <w:color w:val="334155"/>
-        </w:rPr>
-        <w:t>Currently, App.jsx handles state management, API data fetching, modal toggles, polling, and view rendering in a single large file. It needs to be refactored into modular custom hooks and focused components. Furthermore, the application uses a generic /dashboard route for all views. Routing must be made project-specific (e.g., /dashboard/:projectId or /projects/:projectId) to allow bookmarking, deep-linking, and cleaner state synchronization.</w:t>
-      </w:r>
-    </w:p>
-    <w:p>
-      <w:pPr>
-        <w:spacing w:before="280" w:after="80"/>
-      </w:pPr>
-      <w:r>
-        <w:rPr>
-          <w:b/>
-          <w:color w:val="0F172A"/>
-          <w:sz w:val="30"/>
-        </w:rPr>
-        <w:t>5. What We Learned (SEO &amp; GEO Insights)</w:t>
-      </w:r>
-    </w:p>
-    <w:p>
-      <w:pPr>
-        <w:spacing w:line="276" w:lineRule="auto" w:after="80"/>
-      </w:pPr>
-      <w:r>
-        <w:rPr>
-          <w:color w:val="334155"/>
-        </w:rPr>
-        <w:t>1. Traditional SEO vs. Generative Engine Optimization (GEO): Traditional SEO optimizes for Googlebot crawlers, keyword density, and blue link rankings (#1–#10). GEO optimizes for probabilistic LLM knowledge synthesis, entity relationships, and Share of Model (SoM).</w:t>
-        <w:br/>
-        <w:br/>
-        <w:t>2. Zero-Click Search Defense: AI Overviews answer user questions directly on the search results page, leading to significant declines in organic website click-through rates. GEO is a defensive discipline: ensuring a brand is credited and recommended directly inside the synthesized AI answer itself.</w:t>
-        <w:br/>
-        <w:br/>
-        <w:t>3. Entity Salience Over Keywords: Large language models do not match keywords; they retrieve entities based on vector proximity in knowledge graphs. A brand must have dense semantic association with its category across authoritative digital corpora to appear in non-branded queries.</w:t>
-        <w:br/>
-        <w:br/>
-        <w:t>4. Information Gain and Quotability Win Citations: Search retrieval engines powering AI answers prioritize content with high fact density—such as structured comparison tables, verified statistics, and direct definitions—over generic marketing prose.</w:t>
-      </w:r>
-    </w:p>
-    <w:p>
-      <w:pPr>
-        <w:spacing w:before="280" w:after="80"/>
-      </w:pPr>
-      <w:r>
-        <w:rPr>
-          <w:b/>
-          <w:color w:val="0F172A"/>
-          <w:sz w:val="30"/>
-        </w:rPr>
-        <w:t>6. Future Implementation Plan &amp; Technical Roadmap</w:t>
-      </w:r>
-    </w:p>
-    <w:p>
-      <w:pPr>
-        <w:spacing w:line="276" w:lineRule="auto" w:after="80"/>
-      </w:pPr>
-      <w:r>
-        <w:rPr>
-          <w:color w:val="334155"/>
-        </w:rPr>
-        <w:t>To evolve PromptPulse from a working POC into a production-grade monitoring platform, our engineering roadmap focuses on six key initiatives:</w:t>
+        <w:t>Backend &amp; Database Bottlenecks</w:t>
       </w:r>
     </w:p>
     <w:p>
@@ -575,13 +286,13 @@
           <w:b/>
           <w:color w:val="0F172A"/>
         </w:rPr>
-        <w:t>1. Database Optimization &amp; Eager Loading:</w:t>
+        <w:t>N+1 Query Overhead:</w:t>
       </w:r>
       <w:r>
         <w:rPr>
           <w:color w:val="334155"/>
         </w:rPr>
-        <w:t xml:space="preserve"> Eliminate the N+1 query problem in backend/app/api/results.py by using SQLAlchemy joinedload and selectinload to fetch executions, prompts, and citations in a single database roundtrip.</w:t>
+        <w:t xml:space="preserve"> In the results endpoint, fetching executions lazily loaded related prompts, search queries, web results, and mentions in separate queries. On a serverless database, these repeated roundtrips create noticeable API latency.</w:t>
       </w:r>
     </w:p>
     <w:p>
@@ -594,13 +305,26 @@
           <w:b/>
           <w:color w:val="0F172A"/>
         </w:rPr>
-        <w:t>2. Redis Caching Layer:</w:t>
+        <w:t>In-Memory Metric Calculation:</w:t>
       </w:r>
       <w:r>
         <w:rPr>
           <w:color w:val="334155"/>
         </w:rPr>
-        <w:t xml:space="preserve"> Implement Redis caching for project summary endpoints, citation audit tables, and API rate-limiting counters. Summary metrics will be updated via cached rollups rather than recomputed across all rows on every page load.</w:t>
+        <w:t xml:space="preserve"> The summary endpoint (/projects/{id}/summary) loads raw execution rows into Python memory and computes visibility rates and citation counts in application loops. While suitable for POC volumes, this calculation needs to be offloaded to database SQL aggregation (GROUP BY, COUNT) or pre-aggregated rollups.</w:t>
+      </w:r>
+    </w:p>
+    <w:p>
+      <w:pPr>
+        <w:spacing w:before="160" w:after="40"/>
+      </w:pPr>
+      <w:r>
+        <w:rPr>
+          <w:b/>
+          <w:color w:val="1E293B"/>
+          <w:sz w:val="24"/>
+        </w:rPr>
+        <w:t>AI Pipeline &amp; Grounding Bottlenecks</w:t>
       </w:r>
     </w:p>
     <w:p>
@@ -613,13 +337,13 @@
           <w:b/>
           <w:color w:val="0F172A"/>
         </w:rPr>
-        <w:t>3. Distributed Worker Architecture (Celery + Redis):</w:t>
+        <w:t>Concurrency Collapse (Rate Limiting):</w:t>
       </w:r>
       <w:r>
         <w:rPr>
           <w:color w:val="334155"/>
         </w:rPr>
-        <w:t xml:space="preserve"> Replace in-process ThreadPoolExecutor with Celery and Redis worker queues. This enables scheduled background batch runs (e.g. 500 prompts nightly per client) with token-bucket rate limiters.</w:t>
+        <w:t xml:space="preserve"> The initial design attempted to fan out 5 parallel worker threads per batch. However, because each worker chained Tavily search, synthesis LLM, and extraction LLM calls, 15+ concurrent requests overwhelmed free/shared API tiers and triggered HTTP 429 rate limit errors. We throttled execution down to a reliable sequential workflow (~45–60s per batch).</w:t>
       </w:r>
     </w:p>
     <w:p>
@@ -632,13 +356,26 @@
           <w:b/>
           <w:color w:val="0F172A"/>
         </w:rPr>
-        <w:t>4. Deep Recursive Web Crawler:</w:t>
+        <w:t>Snippet Retrieval vs. Deep Crawling:</w:t>
       </w:r>
       <w:r>
         <w:rPr>
           <w:color w:val="334155"/>
         </w:rPr>
-        <w:t xml:space="preserve"> Complement Tavily search with a dedicated headless browser crawler (Playwright / Crawl4AI) capable of crawling 4 levels deep into client websites to index nested service pages and case studies.</w:t>
+        <w:t xml:space="preserve"> Tavily operates as a top-snippet retrieval engine rather than a deep website crawler. For niche B2B domains, it often retrieves high-level directory aggregators and misses deep case studies or service pages nested 3–4 levels into the site.</w:t>
+      </w:r>
+    </w:p>
+    <w:p>
+      <w:pPr>
+        <w:spacing w:before="160" w:after="40"/>
+      </w:pPr>
+      <w:r>
+        <w:rPr>
+          <w:b/>
+          <w:color w:val="1E293B"/>
+          <w:sz w:val="24"/>
+        </w:rPr>
+        <w:t>SEO/GEO Structural Discrepancy</w:t>
       </w:r>
     </w:p>
     <w:p>
@@ -651,13 +388,37 @@
           <w:b/>
           <w:color w:val="0F172A"/>
         </w:rPr>
-        <w:t>5. Frontend Modularization &amp; RESTful Routing:</w:t>
+        <w:t>Mention vs. Citation Asymmetry:</w:t>
       </w:r>
       <w:r>
         <w:rPr>
           <w:color w:val="334155"/>
         </w:rPr>
-        <w:t xml:space="preserve"> Split App.jsx into dedicated custom hooks (useProjects, useRuns, useBatchExecution) and implement React Router with project-specific URLs (/projects/:projectId).</w:t>
+        <w:t xml:space="preserve"> We discovered a frequent divergence between mentions and citations: conceptual queries ('what is X') often cite the brand's domain without explicitly naming the brand in the text, whereas recommendation queries ('best tools for Y') name the brand prominently but cite third-party review listicles rather than the brand's own URL.</w:t>
+      </w:r>
+    </w:p>
+    <w:p>
+      <w:pPr>
+        <w:spacing w:before="280" w:after="80"/>
+      </w:pPr>
+      <w:r>
+        <w:rPr>
+          <w:b/>
+          <w:color w:val="0F172A"/>
+          <w:sz w:val="28"/>
+        </w:rPr>
+        <w:t>4. What We Learned (SEO &amp; GEO Insights)</w:t>
+      </w:r>
+    </w:p>
+    <w:p>
+      <w:pPr>
+        <w:spacing w:line="276" w:lineRule="auto" w:after="80"/>
+      </w:pPr>
+      <w:r>
+        <w:rPr>
+          <w:color w:val="334155"/>
+        </w:rPr>
+        <w:t>Our live evaluations yielded four fundamental principles governing Generative Engine Optimization:</w:t>
       </w:r>
     </w:p>
     <w:p>
@@ -670,13 +431,170 @@
           <w:b/>
           <w:color w:val="0F172A"/>
         </w:rPr>
-        <w:t>6. Multi-Model Benchmarking Matrix:</w:t>
+        <w:t>Rankings vs. Share of Model:</w:t>
       </w:r>
       <w:r>
         <w:rPr>
           <w:color w:val="334155"/>
         </w:rPr>
-        <w:t xml:space="preserve"> Build a benchmarking engine that executes the same prompt suite concurrently across OpenAI GPT-4o Search, Google Gemini 1.5 Pro, Anthropic Claude 3.5, and Perplexity to generate cross-engine visibility comparisons.</w:t>
+        <w:t xml:space="preserve"> Traditional SEO focuses on SERP ranking positions (#1–#10). GEO centers on Share of Model (SoM)—whether an LLM includes the brand in its synthesized response and how it is framed against competitors.</w:t>
+      </w:r>
+    </w:p>
+    <w:p>
+      <w:pPr>
+        <w:pStyle w:val="ListBullet"/>
+        <w:spacing w:line="276" w:lineRule="auto" w:after="80"/>
+      </w:pPr>
+      <w:r>
+        <w:rPr>
+          <w:b/>
+          <w:color w:val="0F172A"/>
+        </w:rPr>
+        <w:t>Zero-Click Search Reality:</w:t>
+      </w:r>
+      <w:r>
+        <w:rPr>
+          <w:color w:val="334155"/>
+        </w:rPr>
+        <w:t xml:space="preserve"> With AI Overviews answering search queries directly, organic click-through rates decline. Brand presence directly within the generated answer is the primary lever for maintaining discovery.</w:t>
+      </w:r>
+    </w:p>
+    <w:p>
+      <w:pPr>
+        <w:pStyle w:val="ListBullet"/>
+        <w:spacing w:line="276" w:lineRule="auto" w:after="80"/>
+      </w:pPr>
+      <w:r>
+        <w:rPr>
+          <w:b/>
+          <w:color w:val="0F172A"/>
+        </w:rPr>
+        <w:t>Entity Salience Over Keywords:</w:t>
+      </w:r>
+      <w:r>
+        <w:rPr>
+          <w:color w:val="334155"/>
+        </w:rPr>
+        <w:t xml:space="preserve"> LLMs retrieve entities based on semantic relationships and vector proximity in knowledge graphs rather than exact keyword density. Broad topical authority across trusted industry sources drives model recall.</w:t>
+      </w:r>
+    </w:p>
+    <w:p>
+      <w:pPr>
+        <w:pStyle w:val="ListBullet"/>
+        <w:spacing w:line="276" w:lineRule="auto" w:after="80"/>
+      </w:pPr>
+      <w:r>
+        <w:rPr>
+          <w:b/>
+          <w:color w:val="0F172A"/>
+        </w:rPr>
+        <w:t>Fact Density &amp; Information Gain:</w:t>
+      </w:r>
+      <w:r>
+        <w:rPr>
+          <w:color w:val="334155"/>
+        </w:rPr>
+        <w:t xml:space="preserve"> Retrieval engines powering AI models preferentially cite content with high information gain—structured comparison tables, verified benchmarks, and concise definitions win citations over marketing fluff.</w:t>
+      </w:r>
+    </w:p>
+    <w:p>
+      <w:pPr>
+        <w:spacing w:before="280" w:after="80"/>
+      </w:pPr>
+      <w:r>
+        <w:rPr>
+          <w:b/>
+          <w:color w:val="0F172A"/>
+          <w:sz w:val="28"/>
+        </w:rPr>
+        <w:t>5. Future Implementation Plan</w:t>
+      </w:r>
+    </w:p>
+    <w:p>
+      <w:pPr>
+        <w:spacing w:line="276" w:lineRule="auto" w:after="80"/>
+      </w:pPr>
+      <w:r>
+        <w:rPr>
+          <w:color w:val="334155"/>
+        </w:rPr>
+        <w:t>Based on the bottlenecks identified, our next development phase focuses on the following technical improvements:</w:t>
+      </w:r>
+    </w:p>
+    <w:p>
+      <w:pPr>
+        <w:pStyle w:val="ListBullet"/>
+        <w:spacing w:line="276" w:lineRule="auto" w:after="80"/>
+      </w:pPr>
+      <w:r>
+        <w:rPr>
+          <w:b/>
+          <w:color w:val="0F172A"/>
+        </w:rPr>
+        <w:t>Database &amp; Query Optimization:</w:t>
+      </w:r>
+      <w:r>
+        <w:rPr>
+          <w:color w:val="334155"/>
+        </w:rPr>
+        <w:t xml:space="preserve"> Eliminate N+1 query overhead using SQLAlchemy joinedload/selectinload and push summary statistics into SQL aggregations, backed by a Redis caching layer for sub-second dashboard loads.</w:t>
+      </w:r>
+    </w:p>
+    <w:p>
+      <w:pPr>
+        <w:pStyle w:val="ListBullet"/>
+        <w:spacing w:line="276" w:lineRule="auto" w:after="80"/>
+      </w:pPr>
+      <w:r>
+        <w:rPr>
+          <w:b/>
+          <w:color w:val="0F172A"/>
+        </w:rPr>
+        <w:t>Asynchronous Worker Queue:</w:t>
+      </w:r>
+      <w:r>
+        <w:rPr>
+          <w:color w:val="334155"/>
+        </w:rPr>
+        <w:t xml:space="preserve"> Replace synchronous in-process execution with Celery and Redis worker queues, incorporating token-bucket rate limiting to run large prompt batches reliably in the background.</w:t>
+      </w:r>
+    </w:p>
+    <w:p>
+      <w:pPr>
+        <w:pStyle w:val="ListBullet"/>
+        <w:spacing w:line="276" w:lineRule="auto" w:after="80"/>
+      </w:pPr>
+      <w:r>
+        <w:rPr>
+          <w:b/>
+          <w:color w:val="0F172A"/>
+        </w:rPr>
+        <w:t>Deep Web Crawler Integration:</w:t>
+      </w:r>
+      <w:r>
+        <w:rPr>
+          <w:color w:val="334155"/>
+        </w:rPr>
+        <w:t xml:space="preserve"> Complement API snippet retrieval with a dedicated headless crawler (Playwright) capable of indexing deep, multi-level website content for technical brands.</w:t>
+      </w:r>
+    </w:p>
+    <w:p>
+      <w:pPr>
+        <w:pStyle w:val="ListBullet"/>
+        <w:spacing w:line="276" w:lineRule="auto" w:after="80"/>
+      </w:pPr>
+      <w:r>
+        <w:rPr>
+          <w:b/>
+          <w:color w:val="0F172A"/>
+        </w:rPr>
+        <w:t>Multi-Model Benchmarking Matrix:</w:t>
+      </w:r>
+      <w:r>
+        <w:rPr>
+          <w:color w:val="334155"/>
+        </w:rPr>
+        <w:t xml:space="preserve"> Expand testing to run standardized prompt suites simultaneously across OpenAI, Google Gemini, and Perplexity to generate comparative cross-engine visibility benchmarks.</w:t>
       </w:r>
     </w:p>
     <w:sectPr>

</xml_diff>